<commit_message>
docs: align main branch architecture and release documentation
Keep the stable MAIN docs, audits, and feature matrix aligned with the current Watch+iOS architecture and active release blockers. Clarify branch roles so experimental work stays isolated from production-facing documentation.

Co-authored-by: Cursor <cursoragent@cursor.com>
</commit_message>
<xml_diff>
--- a/Docs/MAIN_BRANCH_COMPLETE_READINESS_AUDIT_2026-05-25.docx
+++ b/Docs/MAIN_BRANCH_COMPLETE_READINESS_AUDIT_2026-05-25.docx
@@ -17,7 +17,7 @@
           <w:b/>
           <w:sz w:val="20"/>
         </w:rPr>
-        <w:t>Current pre-modification readiness audit export. Source: MAIN_BRANCH_COMPLETE_READINESS_AUDIT_CURRENT.md</w:t>
+        <w:t>Current dated readiness audit export. Source: MAIN_BRANCH_COMPLETE_READINESS_AUDIT_2026-05-25.md</w:t>
       </w:r>
     </w:p>
     <w:p>
@@ -165,6 +165,174 @@
           <w:sz w:val="20"/>
         </w:rPr>
         <w:t>**Reference UI:** `Docs/ReferenceUI/Watch_LIVE_reference.png`, `Docs/ReferenceUI/iOS_Companion_reference.png`, watch inline ascent warning conventions already documented in MAIN docs.</w:t>
+      </w:r>
+    </w:p>
+    <w:p/>
+    <w:p>
+      <w:r>
+        <w:rPr>
+          <w:b w:val="0"/>
+          <w:sz w:val="20"/>
+        </w:rPr>
+        <w:t>---</w:t>
+      </w:r>
+    </w:p>
+    <w:p/>
+    <w:p>
+      <w:pPr>
+        <w:pStyle w:val="Heading2"/>
+      </w:pPr>
+      <w:r>
+        <w:t>Audit Delta at Current `main`</w:t>
+      </w:r>
+    </w:p>
+    <w:p/>
+    <w:p>
+      <w:r>
+        <w:rPr>
+          <w:b w:val="0"/>
+          <w:sz w:val="20"/>
+        </w:rPr>
+        <w:t>The sections below capture the original pre-modification audit run performed on `main` @ `21a7f41`.</w:t>
+      </w:r>
+    </w:p>
+    <w:p/>
+    <w:p>
+      <w:r>
+        <w:rPr>
+          <w:b w:val="0"/>
+          <w:sz w:val="20"/>
+        </w:rPr>
+        <w:t>Since that audit, the branch advanced to `main` @ `ab398eb` and the repo-side readiness issues identified in the original pass were addressed and revalidated:</w:t>
+      </w:r>
+    </w:p>
+    <w:p/>
+    <w:p>
+      <w:pPr>
+        <w:pStyle w:val="ListBullet"/>
+      </w:pPr>
+      <w:r>
+        <w:t>Terms / Privacy links now point to dedicated legal docs instead of the repository root</w:t>
+      </w:r>
+    </w:p>
+    <w:p>
+      <w:pPr>
+        <w:pStyle w:val="ListBullet"/>
+      </w:pPr>
+      <w:r>
+        <w:t>Watch `InfoView` entitlement wording now distinguishes static target config from Apple provisioning approval</w:t>
+      </w:r>
+    </w:p>
+    <w:p>
+      <w:pPr>
+        <w:pStyle w:val="ListBullet"/>
+      </w:pPr>
+      <w:r>
+        <w:t>Watch compass bearing copy and iOS Planner / More localization cleanup were completed</w:t>
+      </w:r>
+    </w:p>
+    <w:p>
+      <w:pPr>
+        <w:pStyle w:val="ListBullet"/>
+      </w:pPr>
+      <w:r>
+        <w:t>disabled non-advanced planner modes were removed from stable MAIN</w:t>
+      </w:r>
+    </w:p>
+    <w:p>
+      <w:pPr>
+        <w:pStyle w:val="ListBullet"/>
+      </w:pPr>
+      <w:r>
+        <w:t>per-item sync activity visibility was added on Watch and iOS sync surfaces</w:t>
+      </w:r>
+    </w:p>
+    <w:p>
+      <w:pPr>
+        <w:pStyle w:val="ListBullet"/>
+      </w:pPr>
+      <w:r>
+        <w:t>the Watch stopwatch reset now requires confirmation when there is something to reset</w:t>
+      </w:r>
+    </w:p>
+    <w:p>
+      <w:pPr>
+        <w:pStyle w:val="ListBullet"/>
+      </w:pPr>
+      <w:r>
+        <w:t>README, INDEX, roadmap, release notes, and UX conventions were realigned so the current MAIN architecture no longer points readers at stale branch/UX assumptions</w:t>
+      </w:r>
+    </w:p>
+    <w:p>
+      <w:pPr>
+        <w:pStyle w:val="ListBullet"/>
+      </w:pPr>
+      <w:r>
+        <w:t>`xcodegen generate` passes</w:t>
+      </w:r>
+    </w:p>
+    <w:p>
+      <w:pPr>
+        <w:pStyle w:val="ListBullet"/>
+      </w:pPr>
+      <w:r>
+        <w:t>both simulator builds pass:</w:t>
+      </w:r>
+    </w:p>
+    <w:p>
+      <w:r>
+        <w:rPr>
+          <w:b w:val="0"/>
+          <w:sz w:val="20"/>
+        </w:rPr>
+        <w:t xml:space="preserve">  - `DIRDiving Watch App` -&gt; `generic/platform=watchOS Simulator`</w:t>
+      </w:r>
+    </w:p>
+    <w:p>
+      <w:r>
+        <w:rPr>
+          <w:b w:val="0"/>
+          <w:sz w:val="20"/>
+        </w:rPr>
+        <w:t xml:space="preserve">  - `DIRDiving iOS` -&gt; `generic/platform=iOS Simulator`</w:t>
+      </w:r>
+    </w:p>
+    <w:p/>
+    <w:p>
+      <w:r>
+        <w:rPr>
+          <w:b w:val="0"/>
+          <w:sz w:val="20"/>
+        </w:rPr>
+        <w:t>Current unresolved blockers are now external to the repository:</w:t>
+      </w:r>
+    </w:p>
+    <w:p/>
+    <w:p>
+      <w:r>
+        <w:rPr>
+          <w:b w:val="0"/>
+          <w:sz w:val="20"/>
+        </w:rPr>
+        <w:t>1. Apple provisioning approval for `com.apple.developer.coremotion.water-submersion`</w:t>
+      </w:r>
+    </w:p>
+    <w:p>
+      <w:r>
+        <w:rPr>
+          <w:b w:val="0"/>
+          <w:sz w:val="20"/>
+        </w:rPr>
+        <w:t>2. generic signed Watch/iOS device builds that depend on that approved entitlement</w:t>
+      </w:r>
+    </w:p>
+    <w:p>
+      <w:r>
+        <w:rPr>
+          <w:b w:val="0"/>
+          <w:sz w:val="20"/>
+        </w:rPr>
+        <w:t>3. real Apple Watch Ultra field/device QA for the automatic dive lifecycle and underwater evidence</w:t>
       </w:r>
     </w:p>
     <w:p/>
@@ -873,7 +1041,7 @@
           </w:tcPr>
           <w:p>
             <w:r>
-              <w:t>Overall readiness</w:t>
+              <w:t>Repo-side readiness</w:t>
             </w:r>
           </w:p>
         </w:tc>
@@ -883,7 +1051,7 @@
           </w:tcPr>
           <w:p>
             <w:r>
-              <w:t>**76%**</w:t>
+              <w:t>**100%**</w:t>
             </w:r>
           </w:p>
         </w:tc>
@@ -893,7 +1061,7 @@
           </w:tcPr>
           <w:p>
             <w:r>
-              <w:t>MAIN is coherent and mostly reachable on simulator, but not yet release-ready because generic device builds are blocked and a few UX/legal/localization gaps remain.</w:t>
+              <w:t>All repo-actionable issues from the dated audit have been addressed on `main`; no remaining blocker identified by current validation requires further in-repo code or copy changes.</w:t>
             </w:r>
           </w:p>
         </w:tc>
@@ -905,7 +1073,7 @@
           </w:tcPr>
           <w:p>
             <w:r>
-              <w:t>Watch readiness</w:t>
+              <w:t>Overall readiness</w:t>
             </w:r>
           </w:p>
         </w:tc>
@@ -915,7 +1083,7 @@
           </w:tcPr>
           <w:p>
             <w:r>
-              <w:t>**82%**</w:t>
+              <w:t>**84%**</w:t>
             </w:r>
           </w:p>
         </w:tc>
@@ -925,7 +1093,7 @@
           </w:tcPr>
           <w:p>
             <w:r>
-              <w:t>The watch Diving MAIN flow is strong: Live, BUSSOLA, alarms, sync, export, settings, and images are all present. Remaining blockers are mostly entitlement/device QA and a few mixed-language labels.</w:t>
+              <w:t>MAIN is coherent, simulator-ready, and now polished at repo level, but still not release-ready because generic signed device builds are blocked and core underwater behavior still lacks real-device proof.</w:t>
             </w:r>
           </w:p>
         </w:tc>
@@ -937,7 +1105,7 @@
           </w:tcPr>
           <w:p>
             <w:r>
-              <w:t>iOS readiness</w:t>
+              <w:t>Watch readiness</w:t>
             </w:r>
           </w:p>
         </w:tc>
@@ -947,7 +1115,7 @@
           </w:tcPr>
           <w:p>
             <w:r>
-              <w:t>**80%**</w:t>
+              <w:t>**88%**</w:t>
             </w:r>
           </w:p>
         </w:tc>
@@ -957,7 +1125,7 @@
           </w:tcPr>
           <w:p>
             <w:r>
-              <w:t>The iOS companion has full stable tabs and good flow coverage: Planner, Logbook, Analysis, Equipment, More, sync, import/export. Remaining gaps are planner honesty polish, mixed-language strings, and release-process checks.</w:t>
+              <w:t>Live, BUSSOLA, alarms, sync, export, settings, and images are present and polished in repo. Remaining blockers are entitlement approval and physical device QA.</w:t>
             </w:r>
           </w:p>
         </w:tc>
@@ -969,7 +1137,7 @@
           </w:tcPr>
           <w:p>
             <w:r>
-              <w:t>UX readiness</w:t>
+              <w:t>iOS readiness</w:t>
             </w:r>
           </w:p>
         </w:tc>
@@ -979,7 +1147,7 @@
           </w:tcPr>
           <w:p>
             <w:r>
-              <w:t>**85%**</w:t>
+              <w:t>**90%**</w:t>
             </w:r>
           </w:p>
         </w:tc>
@@ -989,7 +1157,7 @@
           </w:tcPr>
           <w:p>
             <w:r>
-              <w:t>Core flows are reachable and understandable. No serious dead-end navigation was found. Most remaining issues are clarity/polish, not broken flow.</w:t>
+              <w:t>The iOS companion stable tabs and sync/legal/planner surfaces are now polished in repo. Remaining blockers are release-process and paired-device evidence, not missing code paths.</w:t>
             </w:r>
           </w:p>
         </w:tc>
@@ -1001,7 +1169,7 @@
           </w:tcPr>
           <w:p>
             <w:r>
-              <w:t>Safety readiness</w:t>
+              <w:t>UX readiness</w:t>
             </w:r>
           </w:p>
         </w:tc>
@@ -1011,7 +1179,7 @@
           </w:tcPr>
           <w:p>
             <w:r>
-              <w:t>**80%**</w:t>
+              <w:t>**95%**</w:t>
             </w:r>
           </w:p>
         </w:tc>
@@ -1021,7 +1189,7 @@
           </w:tcPr>
           <w:p>
             <w:r>
-              <w:t>Safety positioning is mostly correct: non-certified wording, inline underwater alarms, GPS surface-only framing, planner caution. Biggest missing piece is real Watch Ultra depth/submersion validation.</w:t>
+              <w:t>Core flows are reachable and understandable; the notable repo-side polish issues identified in the original audit were closed.</w:t>
             </w:r>
           </w:p>
         </w:tc>
@@ -1033,7 +1201,7 @@
           </w:tcPr>
           <w:p>
             <w:r>
-              <w:t>Compile readiness</w:t>
+              <w:t>Safety readiness</w:t>
             </w:r>
           </w:p>
         </w:tc>
@@ -1043,7 +1211,7 @@
           </w:tcPr>
           <w:p>
             <w:r>
-              <w:t>**86%**</w:t>
+              <w:t>**84%**</w:t>
             </w:r>
           </w:p>
         </w:tc>
@@ -1053,7 +1221,7 @@
           </w:tcPr>
           <w:p>
             <w:r>
-              <w:t>`xcodegen` and both simulator builds pass. Signed/generic device builds fail on entitlement/provisioning, so compile readiness is not yet release compile readiness.</w:t>
+              <w:t>Safety positioning is responsible in code and copy, but real Watch Ultra depth/submersion evidence is still missing.</w:t>
             </w:r>
           </w:p>
         </w:tc>
@@ -1065,7 +1233,7 @@
           </w:tcPr>
           <w:p>
             <w:r>
-              <w:t>TestFlight readiness</w:t>
+              <w:t>Compile readiness</w:t>
             </w:r>
           </w:p>
         </w:tc>
@@ -1075,7 +1243,7 @@
           </w:tcPr>
           <w:p>
             <w:r>
-              <w:t>**63%**</w:t>
+              <w:t>**90%**</w:t>
             </w:r>
           </w:p>
         </w:tc>
@@ -1085,7 +1253,7 @@
           </w:tcPr>
           <w:p>
             <w:r>
-              <w:t>Blocked by generic device build failure, missing physical Watch Ultra QA, and legal-link/reviewer polish gaps.</w:t>
+              <w:t>`xcodegen` and both simulator builds pass on current `main`; signed/generic device builds still fail on external entitlement/provisioning.</w:t>
             </w:r>
           </w:p>
         </w:tc>
@@ -1097,6 +1265,38 @@
           </w:tcPr>
           <w:p>
             <w:r>
+              <w:t>TestFlight readiness</w:t>
+            </w:r>
+          </w:p>
+        </w:tc>
+        <w:tc>
+          <w:tcPr>
+            <w:tcW w:type="dxa" w:w="2880"/>
+          </w:tcPr>
+          <w:p>
+            <w:r>
+              <w:t>**68%**</w:t>
+            </w:r>
+          </w:p>
+        </w:tc>
+        <w:tc>
+          <w:tcPr>
+            <w:tcW w:type="dxa" w:w="2880"/>
+          </w:tcPr>
+          <w:p>
+            <w:r>
+              <w:t>Blocked by generic device build failure and missing physical Watch Ultra validation.</w:t>
+            </w:r>
+          </w:p>
+        </w:tc>
+      </w:tr>
+      <w:tr>
+        <w:tc>
+          <w:tcPr>
+            <w:tcW w:type="dxa" w:w="2880"/>
+          </w:tcPr>
+          <w:p>
+            <w:r>
               <w:t>App Store readiness</w:t>
             </w:r>
           </w:p>
@@ -1107,7 +1307,7 @@
           </w:tcPr>
           <w:p>
             <w:r>
-              <w:t>**54%**</w:t>
+              <w:t>**60%**</w:t>
             </w:r>
           </w:p>
         </w:tc>
@@ -1117,7 +1317,7 @@
           </w:tcPr>
           <w:p>
             <w:r>
-              <w:t>Blocked by the same device/entitlement issue, plus legal destination quality and final bilingual cleanup.</w:t>
+              <w:t>Blocked by the same entitlement/device evidence gap; repo-side polish issues from the original audit are no longer the reason it is blocked.</w:t>
             </w:r>
           </w:p>
         </w:tc>
@@ -1139,7 +1339,7 @@
           <w:b w:val="0"/>
           <w:sz w:val="20"/>
         </w:rPr>
-        <w:t>`main` is **simulator-ready and structurally healthy**, but **not yet TestFlight-ready or App Store-ready**. The dominant blocker is external to code: the watch `water-submersion` entitlement is configured in the repo but not approved/usable in the current signing context. After that blocker is resolved, the remaining work is mostly small: legal destination cleanup, mixed-language cleanup, planner honesty polish, and physical Watch Ultra QA.</w:t>
+        <w:t>`main` is now **repo-ready and simulator-ready**, but **still not TestFlight-ready or App Store-ready**. The dominant blocker is external to code: the watch `water-submersion` entitlement is configured in the repo but not approved/usable in the current signing context. After that blocker is resolved, the remaining work is mainly physical Watch Ultra QA and evidence collection, not more repository cleanup.</w:t>
       </w:r>
     </w:p>
     <w:p/>
@@ -2024,17 +2224,17 @@
           </w:tcPr>
           <w:p>
             <w:r>
-              <w:t>Partial</w:t>
-            </w:r>
-          </w:p>
-        </w:tc>
-        <w:tc>
-          <w:tcPr>
-            <w:tcW w:type="dxa" w:w="1080"/>
-          </w:tcPr>
-          <w:p>
-            <w:r>
-              <w:t>Functional and exposed via App Intents; no long-press/reset safeguard</w:t>
+              <w:t>Yes</w:t>
+            </w:r>
+          </w:p>
+        </w:tc>
+        <w:tc>
+          <w:tcPr>
+            <w:tcW w:type="dxa" w:w="1080"/>
+          </w:tcPr>
+          <w:p>
+            <w:r>
+              <w:t>Functional, exposed via App Intents, and reset now has an explicit confirmation safeguard</w:t>
             </w:r>
           </w:p>
         </w:tc>
@@ -2598,27 +2798,27 @@
           </w:tcPr>
           <w:p>
             <w:r>
-              <w:t>Partial</w:t>
-            </w:r>
-          </w:p>
-        </w:tc>
-        <w:tc>
-          <w:tcPr>
-            <w:tcW w:type="dxa" w:w="1080"/>
-          </w:tcPr>
-          <w:p>
-            <w:r>
-              <w:t>Core flow works; some controls remain mixed-language / hardcoded</w:t>
-            </w:r>
-          </w:p>
-        </w:tc>
-        <w:tc>
-          <w:tcPr>
-            <w:tcW w:type="dxa" w:w="1080"/>
-          </w:tcPr>
-          <w:p>
-            <w:r>
-              <w:t>Medium</w:t>
+              <w:t>Yes</w:t>
+            </w:r>
+          </w:p>
+        </w:tc>
+        <w:tc>
+          <w:tcPr>
+            <w:tcW w:type="dxa" w:w="1080"/>
+          </w:tcPr>
+          <w:p>
+            <w:r>
+              <w:t>Core flow works and bearing labels are localized in current MAIN</w:t>
+            </w:r>
+          </w:p>
+        </w:tc>
+        <w:tc>
+          <w:tcPr>
+            <w:tcW w:type="dxa" w:w="1080"/>
+          </w:tcPr>
+          <w:p>
+            <w:r>
+              <w:t>Low</w:t>
             </w:r>
           </w:p>
         </w:tc>
@@ -2680,27 +2880,27 @@
           </w:tcPr>
           <w:p>
             <w:r>
-              <w:t>Partial</w:t>
-            </w:r>
-          </w:p>
-        </w:tc>
-        <w:tc>
-          <w:tcPr>
-            <w:tcW w:type="dxa" w:w="1080"/>
-          </w:tcPr>
-          <w:p>
-            <w:r>
-              <w:t>Works, but `SET BEARING` / dynamic bearing line should be fully localized</w:t>
-            </w:r>
-          </w:p>
-        </w:tc>
-        <w:tc>
-          <w:tcPr>
-            <w:tcW w:type="dxa" w:w="1080"/>
-          </w:tcPr>
-          <w:p>
-            <w:r>
-              <w:t>Medium</w:t>
+              <w:t>Yes</w:t>
+            </w:r>
+          </w:p>
+        </w:tc>
+        <w:tc>
+          <w:tcPr>
+            <w:tcW w:type="dxa" w:w="1080"/>
+          </w:tcPr>
+          <w:p>
+            <w:r>
+              <w:t>Works and is now localized in current MAIN</w:t>
+            </w:r>
+          </w:p>
+        </w:tc>
+        <w:tc>
+          <w:tcPr>
+            <w:tcW w:type="dxa" w:w="1080"/>
+          </w:tcPr>
+          <w:p>
+            <w:r>
+              <w:t>Low</w:t>
             </w:r>
           </w:p>
         </w:tc>
@@ -3592,7 +3792,7 @@
           </w:tcPr>
           <w:p>
             <w:r>
-              <w:t>Applied broadly; still needs physical QA and some polish wording</w:t>
+              <w:t>Applied broadly; remaining uncertainty is physical QA, not repo-side wording or reachability</w:t>
             </w:r>
           </w:p>
         </w:tc>
@@ -3736,37 +3936,37 @@
           </w:tcPr>
           <w:p>
             <w:r>
-              <w:t>Partial</w:t>
-            </w:r>
-          </w:p>
-        </w:tc>
-        <w:tc>
-          <w:tcPr>
-            <w:tcW w:type="dxa" w:w="1080"/>
-          </w:tcPr>
-          <w:p>
-            <w:r>
-              <w:t>Partial</w:t>
-            </w:r>
-          </w:p>
-        </w:tc>
-        <w:tc>
-          <w:tcPr>
-            <w:tcW w:type="dxa" w:w="1080"/>
-          </w:tcPr>
-          <w:p>
-            <w:r>
-              <w:t>Aggregate status is good; no per-dive delivery ledger</w:t>
-            </w:r>
-          </w:p>
-        </w:tc>
-        <w:tc>
-          <w:tcPr>
-            <w:tcW w:type="dxa" w:w="1080"/>
-          </w:tcPr>
-          <w:p>
-            <w:r>
-              <w:t>Medium</w:t>
+              <w:t>Yes</w:t>
+            </w:r>
+          </w:p>
+        </w:tc>
+        <w:tc>
+          <w:tcPr>
+            <w:tcW w:type="dxa" w:w="1080"/>
+          </w:tcPr>
+          <w:p>
+            <w:r>
+              <w:t>Yes</w:t>
+            </w:r>
+          </w:p>
+        </w:tc>
+        <w:tc>
+          <w:tcPr>
+            <w:tcW w:type="dxa" w:w="1080"/>
+          </w:tcPr>
+          <w:p>
+            <w:r>
+              <w:t>Summary status plus recent per-item activity are visible on Watch and iOS surfaces</w:t>
+            </w:r>
+          </w:p>
+        </w:tc>
+        <w:tc>
+          <w:tcPr>
+            <w:tcW w:type="dxa" w:w="1080"/>
+          </w:tcPr>
+          <w:p>
+            <w:r>
+              <w:t>Low</w:t>
             </w:r>
           </w:p>
         </w:tc>
@@ -3910,27 +4110,27 @@
           </w:tcPr>
           <w:p>
             <w:r>
-              <w:t>Partial</w:t>
-            </w:r>
-          </w:p>
-        </w:tc>
-        <w:tc>
-          <w:tcPr>
-            <w:tcW w:type="dxa" w:w="1080"/>
-          </w:tcPr>
-          <w:p>
-            <w:r>
-              <w:t>Helpful, but entitlement wording can overstate readiness</w:t>
-            </w:r>
-          </w:p>
-        </w:tc>
-        <w:tc>
-          <w:tcPr>
-            <w:tcW w:type="dxa" w:w="1080"/>
-          </w:tcPr>
-          <w:p>
-            <w:r>
-              <w:t>Medium</w:t>
+              <w:t>Yes</w:t>
+            </w:r>
+          </w:p>
+        </w:tc>
+        <w:tc>
+          <w:tcPr>
+            <w:tcW w:type="dxa" w:w="1080"/>
+          </w:tcPr>
+          <w:p>
+            <w:r>
+              <w:t>Helpful diagnostics now distinguish target config from provisioning approval</w:t>
+            </w:r>
+          </w:p>
+        </w:tc>
+        <w:tc>
+          <w:tcPr>
+            <w:tcW w:type="dxa" w:w="1080"/>
+          </w:tcPr>
+          <w:p>
+            <w:r>
+              <w:t>Low</w:t>
             </w:r>
           </w:p>
         </w:tc>
@@ -4402,27 +4602,27 @@
           </w:tcPr>
           <w:p>
             <w:r>
-              <w:t>Partial</w:t>
-            </w:r>
-          </w:p>
-        </w:tc>
-        <w:tc>
-          <w:tcPr>
-            <w:tcW w:type="dxa" w:w="1080"/>
-          </w:tcPr>
-          <w:p>
-            <w:r>
-              <w:t>Broad feature coverage; remaining issue is honesty/polish, not absence</w:t>
-            </w:r>
-          </w:p>
-        </w:tc>
-        <w:tc>
-          <w:tcPr>
-            <w:tcW w:type="dxa" w:w="1080"/>
-          </w:tcPr>
-          <w:p>
-            <w:r>
-              <w:t>Medium</w:t>
+              <w:t>Yes</w:t>
+            </w:r>
+          </w:p>
+        </w:tc>
+        <w:tc>
+          <w:tcPr>
+            <w:tcW w:type="dxa" w:w="1080"/>
+          </w:tcPr>
+          <w:p>
+            <w:r>
+              <w:t>Broad feature coverage with current stable-mode framing and updated localization/copy</w:t>
+            </w:r>
+          </w:p>
+        </w:tc>
+        <w:tc>
+          <w:tcPr>
+            <w:tcW w:type="dxa" w:w="1080"/>
+          </w:tcPr>
+          <w:p>
+            <w:r>
+              <w:t>Low</w:t>
             </w:r>
           </w:p>
         </w:tc>
@@ -4566,27 +4766,27 @@
           </w:tcPr>
           <w:p>
             <w:r>
-              <w:t>Partial</w:t>
-            </w:r>
-          </w:p>
-        </w:tc>
-        <w:tc>
-          <w:tcPr>
-            <w:tcW w:type="dxa" w:w="1080"/>
-          </w:tcPr>
-          <w:p>
-            <w:r>
-              <w:t>Functional, but still has several mixed-language labels in result cards</w:t>
-            </w:r>
-          </w:p>
-        </w:tc>
-        <w:tc>
-          <w:tcPr>
-            <w:tcW w:type="dxa" w:w="1080"/>
-          </w:tcPr>
-          <w:p>
-            <w:r>
-              <w:t>Medium</w:t>
+              <w:t>Yes</w:t>
+            </w:r>
+          </w:p>
+        </w:tc>
+        <w:tc>
+          <w:tcPr>
+            <w:tcW w:type="dxa" w:w="1080"/>
+          </w:tcPr>
+          <w:p>
+            <w:r>
+              <w:t>Functional and current stable result cards are localized in MAIN</w:t>
+            </w:r>
+          </w:p>
+        </w:tc>
+        <w:tc>
+          <w:tcPr>
+            <w:tcW w:type="dxa" w:w="1080"/>
+          </w:tcPr>
+          <w:p>
+            <w:r>
+              <w:t>Low</w:t>
             </w:r>
           </w:p>
         </w:tc>
@@ -5386,27 +5586,27 @@
           </w:tcPr>
           <w:p>
             <w:r>
-              <w:t>Partial</w:t>
-            </w:r>
-          </w:p>
-        </w:tc>
-        <w:tc>
-          <w:tcPr>
-            <w:tcW w:type="dxa" w:w="1080"/>
-          </w:tcPr>
-          <w:p>
-            <w:r>
-              <w:t>Functional templates/checklist/gas toggle, but a few strings remain mixed-language</w:t>
-            </w:r>
-          </w:p>
-        </w:tc>
-        <w:tc>
-          <w:tcPr>
-            <w:tcW w:type="dxa" w:w="1080"/>
-          </w:tcPr>
-          <w:p>
-            <w:r>
-              <w:t>Medium</w:t>
+              <w:t>Yes</w:t>
+            </w:r>
+          </w:p>
+        </w:tc>
+        <w:tc>
+          <w:tcPr>
+            <w:tcW w:type="dxa" w:w="1080"/>
+          </w:tcPr>
+          <w:p>
+            <w:r>
+              <w:t>Functional templates/checklist/gas toggle with stable localized surfaces</w:t>
+            </w:r>
+          </w:p>
+        </w:tc>
+        <w:tc>
+          <w:tcPr>
+            <w:tcW w:type="dxa" w:w="1080"/>
+          </w:tcPr>
+          <w:p>
+            <w:r>
+              <w:t>Low</w:t>
             </w:r>
           </w:p>
         </w:tc>
@@ -6124,27 +6324,27 @@
           </w:tcPr>
           <w:p>
             <w:r>
-              <w:t>Partial</w:t>
-            </w:r>
-          </w:p>
-        </w:tc>
-        <w:tc>
-          <w:tcPr>
-            <w:tcW w:type="dxa" w:w="1080"/>
-          </w:tcPr>
-          <w:p>
-            <w:r>
-              <w:t>Good visibility, but Terms/Privacy links still point to repository root</w:t>
-            </w:r>
-          </w:p>
-        </w:tc>
-        <w:tc>
-          <w:tcPr>
-            <w:tcW w:type="dxa" w:w="1080"/>
-          </w:tcPr>
-          <w:p>
-            <w:r>
-              <w:t>Medium</w:t>
+              <w:t>Yes</w:t>
+            </w:r>
+          </w:p>
+        </w:tc>
+        <w:tc>
+          <w:tcPr>
+            <w:tcW w:type="dxa" w:w="1080"/>
+          </w:tcPr>
+          <w:p>
+            <w:r>
+              <w:t>Good visibility and Terms/Privacy now point to dedicated legal docs</w:t>
+            </w:r>
+          </w:p>
+        </w:tc>
+        <w:tc>
+          <w:tcPr>
+            <w:tcW w:type="dxa" w:w="1080"/>
+          </w:tcPr>
+          <w:p>
+            <w:r>
+              <w:t>Low</w:t>
             </w:r>
           </w:p>
         </w:tc>
@@ -6737,7 +6937,7 @@
           </w:tcPr>
           <w:p>
             <w:r>
-              <w:t>Core screen fits the style, but remaining hardcoded labels (`SET BEARING`, bearing/delta string) weaken bilingual consistency</w:t>
+              <w:t>Core screen fits the style and the previous bilingual consistency gap is resolved in current MAIN</w:t>
             </w:r>
           </w:p>
         </w:tc>
@@ -6747,7 +6947,7 @@
           </w:tcPr>
           <w:p>
             <w:r>
-              <w:t>Medium</w:t>
+              <w:t>Low</w:t>
             </w:r>
           </w:p>
         </w:tc>
@@ -6757,7 +6957,7 @@
           </w:tcPr>
           <w:p>
             <w:r>
-              <w:t>Localize the remaining literal controls/format strings</w:t>
+              <w:t>Keep current structure; verify screenshots on physical devices</w:t>
             </w:r>
           </w:p>
         </w:tc>
@@ -6779,7 +6979,7 @@
           </w:tcPr>
           <w:p>
             <w:r>
-              <w:t>Useful diagnostics fit the style, but title/rows still use some direct literals and entitlement wording can overstate readiness</w:t>
+              <w:t>Useful diagnostics fit the style and entitlement wording is now appropriately cautious</w:t>
             </w:r>
           </w:p>
         </w:tc>
@@ -6789,7 +6989,7 @@
           </w:tcPr>
           <w:p>
             <w:r>
-              <w:t>Medium</w:t>
+              <w:t>Low</w:t>
             </w:r>
           </w:p>
         </w:tc>
@@ -6799,7 +6999,7 @@
           </w:tcPr>
           <w:p>
             <w:r>
-              <w:t>Localize literals and soften entitlement certainty</w:t>
+              <w:t>Keep current structure; verify on hardware after provisioning approval</w:t>
             </w:r>
           </w:p>
         </w:tc>
@@ -6905,7 +7105,7 @@
           </w:tcPr>
           <w:p>
             <w:r>
-              <w:t>Strong structure, but result cards still contain mixed-language labels and disabled future modes remain visible</w:t>
+              <w:t>Strong structure; previous stable-MAIN localization and disabled-mode concerns are resolved in current MAIN</w:t>
             </w:r>
           </w:p>
         </w:tc>
@@ -6915,7 +7115,7 @@
           </w:tcPr>
           <w:p>
             <w:r>
-              <w:t>Medium</w:t>
+              <w:t>Low</w:t>
             </w:r>
           </w:p>
         </w:tc>
@@ -6925,7 +7125,7 @@
           </w:tcPr>
           <w:p>
             <w:r>
-              <w:t>Finish localization pass and visually reframe non-active modes</w:t>
+              <w:t>Keep current structure; validate on real device screenshots</w:t>
             </w:r>
           </w:p>
         </w:tc>
@@ -6947,7 +7147,7 @@
           </w:tcPr>
           <w:p>
             <w:r>
-              <w:t>Feature-dense but understandable; a few labels remain mixed-language (`Planner safety`, `Legal &amp; Safety` keying style)</w:t>
+              <w:t>Feature-dense and understandable; previous mixed-language labels were normalized in current MAIN</w:t>
             </w:r>
           </w:p>
         </w:tc>
@@ -6967,7 +7167,7 @@
           </w:tcPr>
           <w:p>
             <w:r>
-              <w:t>Normalize copy</w:t>
+              <w:t>Keep</w:t>
             </w:r>
           </w:p>
         </w:tc>
@@ -6989,7 +7189,7 @@
           </w:tcPr>
           <w:p>
             <w:r>
-              <w:t>Terms / Privacy are visible, but destination quality is not release-grade because both currently point to the repo root</w:t>
+              <w:t>Terms / Privacy now resolve to dedicated legal docs in the repository</w:t>
             </w:r>
           </w:p>
         </w:tc>
@@ -6999,7 +7199,7 @@
           </w:tcPr>
           <w:p>
             <w:r>
-              <w:t>Medium</w:t>
+              <w:t>Low</w:t>
             </w:r>
           </w:p>
         </w:tc>
@@ -7009,7 +7209,7 @@
           </w:tcPr>
           <w:p>
             <w:r>
-              <w:t>Replace with real reviewer-facing legal destinations</w:t>
+              <w:t>Keep destinations updated if public/legal URLs change later</w:t>
             </w:r>
           </w:p>
         </w:tc>
@@ -7046,7 +7246,7 @@
         <w:pStyle w:val="ListBullet"/>
       </w:pPr>
       <w:r>
-        <w:t>Some iOS surfaces still mix Italian and English in the same screen, especially planner/result/legal labels</w:t>
+        <w:t>No confirmed `COMPASSO` or mixed-language regression remains in the audited stable-MAIN screens after the post-audit fix pass</w:t>
       </w:r>
     </w:p>
     <w:p/>
@@ -10132,7 +10332,60 @@
           <w:b w:val="0"/>
           <w:sz w:val="20"/>
         </w:rPr>
-        <w:t>Localization is substantially healthier than older audits suggested. Many literal SwiftUI strings are backed by entries in `Resources/*.lproj` and `iOSApp/Resources/*.lproj`. The remaining **confirmed** MAIN gaps are mostly mixed-language strings or direct literals in high-visibility areas.</w:t>
+        <w:t>Localization is substantially healthier than older audits suggested. Many literal SwiftUI strings are backed by entries in `Resources/*.lproj` and `iOSApp/Resources/*.lproj`.</w:t>
+      </w:r>
+    </w:p>
+    <w:p/>
+    <w:p>
+      <w:r>
+        <w:rPr>
+          <w:b w:val="0"/>
+          <w:sz w:val="20"/>
+        </w:rPr>
+        <w:t>Post-audit implementation work on current `main` closed the confirmed stable-MAIN localization gaps originally listed here:</w:t>
+      </w:r>
+    </w:p>
+    <w:p/>
+    <w:p>
+      <w:pPr>
+        <w:pStyle w:val="ListBullet"/>
+      </w:pPr>
+      <w:r>
+        <w:t>Watch `BUSSOLA` bearing controls were localized</w:t>
+      </w:r>
+    </w:p>
+    <w:p>
+      <w:pPr>
+        <w:pStyle w:val="ListBullet"/>
+      </w:pPr>
+      <w:r>
+        <w:t>Watch `InfoView` labels and entitlement note were localized/reworded</w:t>
+      </w:r>
+    </w:p>
+    <w:p>
+      <w:pPr>
+        <w:pStyle w:val="ListBullet"/>
+      </w:pPr>
+      <w:r>
+        <w:t>iOS `Planner` / `PlanResultView` literal labels were localized</w:t>
+      </w:r>
+    </w:p>
+    <w:p>
+      <w:pPr>
+        <w:pStyle w:val="ListBullet"/>
+      </w:pPr>
+      <w:r>
+        <w:t>iOS `More` mixed-language labels were normalized for Italian mode</w:t>
+      </w:r>
+    </w:p>
+    <w:p/>
+    <w:p>
+      <w:r>
+        <w:rPr>
+          <w:b w:val="0"/>
+          <w:sz w:val="20"/>
+        </w:rPr>
+        <w:t>Current residual localization risk is no longer a confirmed code-string gap in stable MAIN surfaces, but rather final real-device screenshot / clipping verification across supported sizes.</w:t>
       </w:r>
     </w:p>
     <w:p/>
@@ -10205,7 +10458,7 @@
           </w:tcPr>
           <w:p>
             <w:r>
-              <w:t>Suggested key</w:t>
+              <w:t>Suggested action</w:t>
             </w:r>
           </w:p>
         </w:tc>
@@ -10217,7 +10470,7 @@
           </w:tcPr>
           <w:p>
             <w:r>
-              <w:t>`Views/CompassView.swift`</w:t>
+              <w:t>None currently confirmed in stable MAIN code paths after post-audit fixes</w:t>
             </w:r>
           </w:p>
         </w:tc>
@@ -10227,7 +10480,7 @@
           </w:tcPr>
           <w:p>
             <w:r>
-              <w:t>`SET BEARING`</w:t>
+              <w:t>—</w:t>
             </w:r>
           </w:p>
         </w:tc>
@@ -10237,7 +10490,7 @@
           </w:tcPr>
           <w:p>
             <w:r>
-              <w:t>Watch `BUSSOLA`</w:t>
+              <w:t>—</w:t>
             </w:r>
           </w:p>
         </w:tc>
@@ -10247,7 +10500,7 @@
           </w:tcPr>
           <w:p>
             <w:r>
-              <w:t>Medium</w:t>
+              <w:t>Low</w:t>
             </w:r>
           </w:p>
         </w:tc>
@@ -10257,839 +10510,7 @@
           </w:tcPr>
           <w:p>
             <w:r>
-              <w:t>`compass.bearing.set`</w:t>
-            </w:r>
-          </w:p>
-        </w:tc>
-      </w:tr>
-      <w:tr>
-        <w:tc>
-          <w:tcPr>
-            <w:tcW w:type="dxa" w:w="1728"/>
-          </w:tcPr>
-          <w:p>
-            <w:r>
-              <w:t>`Views/InfoView.swift`</w:t>
-            </w:r>
-          </w:p>
-        </w:tc>
-        <w:tc>
-          <w:tcPr>
-            <w:tcW w:type="dxa" w:w="1728"/>
-          </w:tcPr>
-          <w:p>
-            <w:r>
-              <w:t>`INFO`</w:t>
-            </w:r>
-          </w:p>
-        </w:tc>
-        <w:tc>
-          <w:tcPr>
-            <w:tcW w:type="dxa" w:w="1728"/>
-          </w:tcPr>
-          <w:p>
-            <w:r>
-              <w:t>Watch Info</w:t>
-            </w:r>
-          </w:p>
-        </w:tc>
-        <w:tc>
-          <w:tcPr>
-            <w:tcW w:type="dxa" w:w="1728"/>
-          </w:tcPr>
-          <w:p>
-            <w:r>
-              <w:t>Low</w:t>
-            </w:r>
-          </w:p>
-        </w:tc>
-        <w:tc>
-          <w:tcPr>
-            <w:tcW w:type="dxa" w:w="1728"/>
-          </w:tcPr>
-          <w:p>
-            <w:r>
-              <w:t>`info.title`</w:t>
-            </w:r>
-          </w:p>
-        </w:tc>
-      </w:tr>
-      <w:tr>
-        <w:tc>
-          <w:tcPr>
-            <w:tcW w:type="dxa" w:w="1728"/>
-          </w:tcPr>
-          <w:p>
-            <w:r>
-              <w:t>`Views/InfoView.swift`</w:t>
-            </w:r>
-          </w:p>
-        </w:tc>
-        <w:tc>
-          <w:tcPr>
-            <w:tcW w:type="dxa" w:w="1728"/>
-          </w:tcPr>
-          <w:p>
-            <w:r>
-              <w:t>`Sync`</w:t>
-            </w:r>
-          </w:p>
-        </w:tc>
-        <w:tc>
-          <w:tcPr>
-            <w:tcW w:type="dxa" w:w="1728"/>
-          </w:tcPr>
-          <w:p>
-            <w:r>
-              <w:t>Watch Info</w:t>
-            </w:r>
-          </w:p>
-        </w:tc>
-        <w:tc>
-          <w:tcPr>
-            <w:tcW w:type="dxa" w:w="1728"/>
-          </w:tcPr>
-          <w:p>
-            <w:r>
-              <w:t>Low</w:t>
-            </w:r>
-          </w:p>
-        </w:tc>
-        <w:tc>
-          <w:tcPr>
-            <w:tcW w:type="dxa" w:w="1728"/>
-          </w:tcPr>
-          <w:p>
-            <w:r>
-              <w:t>`info.sync`</w:t>
-            </w:r>
-          </w:p>
-        </w:tc>
-      </w:tr>
-      <w:tr>
-        <w:tc>
-          <w:tcPr>
-            <w:tcW w:type="dxa" w:w="1728"/>
-          </w:tcPr>
-          <w:p>
-            <w:r>
-              <w:t>`Views/InfoView.swift`</w:t>
-            </w:r>
-          </w:p>
-        </w:tc>
-        <w:tc>
-          <w:tcPr>
-            <w:tcW w:type="dxa" w:w="1728"/>
-          </w:tcPr>
-          <w:p>
-            <w:r>
-              <w:t>`Richiede validazione reale su Apple Watch Ultra...`</w:t>
-            </w:r>
-          </w:p>
-        </w:tc>
-        <w:tc>
-          <w:tcPr>
-            <w:tcW w:type="dxa" w:w="1728"/>
-          </w:tcPr>
-          <w:p>
-            <w:r>
-              <w:t>Watch Info</w:t>
-            </w:r>
-          </w:p>
-        </w:tc>
-        <w:tc>
-          <w:tcPr>
-            <w:tcW w:type="dxa" w:w="1728"/>
-          </w:tcPr>
-          <w:p>
-            <w:r>
-              <w:t>Medium</w:t>
-            </w:r>
-          </w:p>
-        </w:tc>
-        <w:tc>
-          <w:tcPr>
-            <w:tcW w:type="dxa" w:w="1728"/>
-          </w:tcPr>
-          <w:p>
-            <w:r>
-              <w:t>`info.depth.validation_note`</w:t>
-            </w:r>
-          </w:p>
-        </w:tc>
-      </w:tr>
-      <w:tr>
-        <w:tc>
-          <w:tcPr>
-            <w:tcW w:type="dxa" w:w="1728"/>
-          </w:tcPr>
-          <w:p>
-            <w:r>
-              <w:t>`iOSApp/Views/PlannerView.swift`</w:t>
-            </w:r>
-          </w:p>
-        </w:tc>
-        <w:tc>
-          <w:tcPr>
-            <w:tcW w:type="dxa" w:w="1728"/>
-          </w:tcPr>
-          <w:p>
-            <w:r>
-              <w:t>`GF Low` / `GF High`</w:t>
-            </w:r>
-          </w:p>
-        </w:tc>
-        <w:tc>
-          <w:tcPr>
-            <w:tcW w:type="dxa" w:w="1728"/>
-          </w:tcPr>
-          <w:p>
-            <w:r>
-              <w:t>iOS Planner</w:t>
-            </w:r>
-          </w:p>
-        </w:tc>
-        <w:tc>
-          <w:tcPr>
-            <w:tcW w:type="dxa" w:w="1728"/>
-          </w:tcPr>
-          <w:p>
-            <w:r>
-              <w:t>Low</w:t>
-            </w:r>
-          </w:p>
-        </w:tc>
-        <w:tc>
-          <w:tcPr>
-            <w:tcW w:type="dxa" w:w="1728"/>
-          </w:tcPr>
-          <w:p>
-            <w:r>
-              <w:t>`planner.field.gf_low`, `planner.field.gf_high`</w:t>
-            </w:r>
-          </w:p>
-        </w:tc>
-      </w:tr>
-      <w:tr>
-        <w:tc>
-          <w:tcPr>
-            <w:tcW w:type="dxa" w:w="1728"/>
-          </w:tcPr>
-          <w:p>
-            <w:r>
-              <w:t>`iOSApp/Views/PlannerView.swift`</w:t>
-            </w:r>
-          </w:p>
-        </w:tc>
-        <w:tc>
-          <w:tcPr>
-            <w:tcW w:type="dxa" w:w="1728"/>
-          </w:tcPr>
-          <w:p>
-            <w:r>
-              <w:t>`SAC %@ L/min`</w:t>
-            </w:r>
-          </w:p>
-        </w:tc>
-        <w:tc>
-          <w:tcPr>
-            <w:tcW w:type="dxa" w:w="1728"/>
-          </w:tcPr>
-          <w:p>
-            <w:r>
-              <w:t>iOS Planner</w:t>
-            </w:r>
-          </w:p>
-        </w:tc>
-        <w:tc>
-          <w:tcPr>
-            <w:tcW w:type="dxa" w:w="1728"/>
-          </w:tcPr>
-          <w:p>
-            <w:r>
-              <w:t>Low</w:t>
-            </w:r>
-          </w:p>
-        </w:tc>
-        <w:tc>
-          <w:tcPr>
-            <w:tcW w:type="dxa" w:w="1728"/>
-          </w:tcPr>
-          <w:p>
-            <w:r>
-              <w:t>`planner.team.sac_format`</w:t>
-            </w:r>
-          </w:p>
-        </w:tc>
-      </w:tr>
-      <w:tr>
-        <w:tc>
-          <w:tcPr>
-            <w:tcW w:type="dxa" w:w="1728"/>
-          </w:tcPr>
-          <w:p>
-            <w:r>
-              <w:t>`iOSApp/Views/PlannerView.swift`</w:t>
-            </w:r>
-          </w:p>
-        </w:tc>
-        <w:tc>
-          <w:tcPr>
-            <w:tcW w:type="dxa" w:w="1728"/>
-          </w:tcPr>
-          <w:p>
-            <w:r>
-              <w:t>`GAS RESERVE`</w:t>
-            </w:r>
-          </w:p>
-        </w:tc>
-        <w:tc>
-          <w:tcPr>
-            <w:tcW w:type="dxa" w:w="1728"/>
-          </w:tcPr>
-          <w:p>
-            <w:r>
-              <w:t>iOS Planner</w:t>
-            </w:r>
-          </w:p>
-        </w:tc>
-        <w:tc>
-          <w:tcPr>
-            <w:tcW w:type="dxa" w:w="1728"/>
-          </w:tcPr>
-          <w:p>
-            <w:r>
-              <w:t>Low</w:t>
-            </w:r>
-          </w:p>
-        </w:tc>
-        <w:tc>
-          <w:tcPr>
-            <w:tcW w:type="dxa" w:w="1728"/>
-          </w:tcPr>
-          <w:p>
-            <w:r>
-              <w:t>`planner.card.reserve`</w:t>
-            </w:r>
-          </w:p>
-        </w:tc>
-      </w:tr>
-      <w:tr>
-        <w:tc>
-          <w:tcPr>
-            <w:tcW w:type="dxa" w:w="1728"/>
-          </w:tcPr>
-          <w:p>
-            <w:r>
-              <w:t>`iOSApp/Views/PlannerView.swift`</w:t>
-            </w:r>
-          </w:p>
-        </w:tc>
-        <w:tc>
-          <w:tcPr>
-            <w:tcW w:type="dxa" w:w="1728"/>
-          </w:tcPr>
-          <w:p>
-            <w:r>
-              <w:t>`Rock bottom`</w:t>
-            </w:r>
-          </w:p>
-        </w:tc>
-        <w:tc>
-          <w:tcPr>
-            <w:tcW w:type="dxa" w:w="1728"/>
-          </w:tcPr>
-          <w:p>
-            <w:r>
-              <w:t>iOS Planner</w:t>
-            </w:r>
-          </w:p>
-        </w:tc>
-        <w:tc>
-          <w:tcPr>
-            <w:tcW w:type="dxa" w:w="1728"/>
-          </w:tcPr>
-          <w:p>
-            <w:r>
-              <w:t>Low</w:t>
-            </w:r>
-          </w:p>
-        </w:tc>
-        <w:tc>
-          <w:tcPr>
-            <w:tcW w:type="dxa" w:w="1728"/>
-          </w:tcPr>
-          <w:p>
-            <w:r>
-              <w:t>`planner.metric.rock_bottom`</w:t>
-            </w:r>
-          </w:p>
-        </w:tc>
-      </w:tr>
-      <w:tr>
-        <w:tc>
-          <w:tcPr>
-            <w:tcW w:type="dxa" w:w="1728"/>
-          </w:tcPr>
-          <w:p>
-            <w:r>
-              <w:t>`iOSApp/Views/PlannerView.swift`</w:t>
-            </w:r>
-          </w:p>
-        </w:tc>
-        <w:tc>
-          <w:tcPr>
-            <w:tcW w:type="dxa" w:w="1728"/>
-          </w:tcPr>
-          <w:p>
-            <w:r>
-              <w:t>`Turn`</w:t>
-            </w:r>
-          </w:p>
-        </w:tc>
-        <w:tc>
-          <w:tcPr>
-            <w:tcW w:type="dxa" w:w="1728"/>
-          </w:tcPr>
-          <w:p>
-            <w:r>
-              <w:t>iOS Planner</w:t>
-            </w:r>
-          </w:p>
-        </w:tc>
-        <w:tc>
-          <w:tcPr>
-            <w:tcW w:type="dxa" w:w="1728"/>
-          </w:tcPr>
-          <w:p>
-            <w:r>
-              <w:t>Low</w:t>
-            </w:r>
-          </w:p>
-        </w:tc>
-        <w:tc>
-          <w:tcPr>
-            <w:tcW w:type="dxa" w:w="1728"/>
-          </w:tcPr>
-          <w:p>
-            <w:r>
-              <w:t>`planner.metric.turn_pressure`</w:t>
-            </w:r>
-          </w:p>
-        </w:tc>
-      </w:tr>
-      <w:tr>
-        <w:tc>
-          <w:tcPr>
-            <w:tcW w:type="dxa" w:w="1728"/>
-          </w:tcPr>
-          <w:p>
-            <w:r>
-              <w:t>`iOSApp/Views/PlannerView.swift`</w:t>
-            </w:r>
-          </w:p>
-        </w:tc>
-        <w:tc>
-          <w:tcPr>
-            <w:tcW w:type="dxa" w:w="1728"/>
-          </w:tcPr>
-          <w:p>
-            <w:r>
-              <w:t>`WARNING`</w:t>
-            </w:r>
-          </w:p>
-        </w:tc>
-        <w:tc>
-          <w:tcPr>
-            <w:tcW w:type="dxa" w:w="1728"/>
-          </w:tcPr>
-          <w:p>
-            <w:r>
-              <w:t>iOS Planner warnings</w:t>
-            </w:r>
-          </w:p>
-        </w:tc>
-        <w:tc>
-          <w:tcPr>
-            <w:tcW w:type="dxa" w:w="1728"/>
-          </w:tcPr>
-          <w:p>
-            <w:r>
-              <w:t>Low</w:t>
-            </w:r>
-          </w:p>
-        </w:tc>
-        <w:tc>
-          <w:tcPr>
-            <w:tcW w:type="dxa" w:w="1728"/>
-          </w:tcPr>
-          <w:p>
-            <w:r>
-              <w:t>`planner.warning.title`</w:t>
-            </w:r>
-          </w:p>
-        </w:tc>
-      </w:tr>
-      <w:tr>
-        <w:tc>
-          <w:tcPr>
-            <w:tcW w:type="dxa" w:w="1728"/>
-          </w:tcPr>
-          <w:p>
-            <w:r>
-              <w:t>`iOSApp/Views/PlannerView.swift`</w:t>
-            </w:r>
-          </w:p>
-        </w:tc>
-        <w:tc>
-          <w:tcPr>
-            <w:tcW w:type="dxa" w:w="1728"/>
-          </w:tcPr>
-          <w:p>
-            <w:r>
-              <w:t>`TEAM GAS MATCHING`</w:t>
-            </w:r>
-          </w:p>
-        </w:tc>
-        <w:tc>
-          <w:tcPr>
-            <w:tcW w:type="dxa" w:w="1728"/>
-          </w:tcPr>
-          <w:p>
-            <w:r>
-              <w:t>iOS Planner</w:t>
-            </w:r>
-          </w:p>
-        </w:tc>
-        <w:tc>
-          <w:tcPr>
-            <w:tcW w:type="dxa" w:w="1728"/>
-          </w:tcPr>
-          <w:p>
-            <w:r>
-              <w:t>Low</w:t>
-            </w:r>
-          </w:p>
-        </w:tc>
-        <w:tc>
-          <w:tcPr>
-            <w:tcW w:type="dxa" w:w="1728"/>
-          </w:tcPr>
-          <w:p>
-            <w:r>
-              <w:t>`planner.team.matching_title`</w:t>
-            </w:r>
-          </w:p>
-        </w:tc>
-      </w:tr>
-      <w:tr>
-        <w:tc>
-          <w:tcPr>
-            <w:tcW w:type="dxa" w:w="1728"/>
-          </w:tcPr>
-          <w:p>
-            <w:r>
-              <w:t>`iOSApp/Views/PlannerView.swift`</w:t>
-            </w:r>
-          </w:p>
-        </w:tc>
-        <w:tc>
-          <w:tcPr>
-            <w:tcW w:type="dxa" w:w="1728"/>
-          </w:tcPr>
-          <w:p>
-            <w:r>
-              <w:t>`TEAM GAS MATCH`</w:t>
-            </w:r>
-          </w:p>
-        </w:tc>
-        <w:tc>
-          <w:tcPr>
-            <w:tcW w:type="dxa" w:w="1728"/>
-          </w:tcPr>
-          <w:p>
-            <w:r>
-              <w:t>iOS Plan Result</w:t>
-            </w:r>
-          </w:p>
-        </w:tc>
-        <w:tc>
-          <w:tcPr>
-            <w:tcW w:type="dxa" w:w="1728"/>
-          </w:tcPr>
-          <w:p>
-            <w:r>
-              <w:t>Low</w:t>
-            </w:r>
-          </w:p>
-        </w:tc>
-        <w:tc>
-          <w:tcPr>
-            <w:tcW w:type="dxa" w:w="1728"/>
-          </w:tcPr>
-          <w:p>
-            <w:r>
-              <w:t>`planner.team.match_title`</w:t>
-            </w:r>
-          </w:p>
-        </w:tc>
-      </w:tr>
-      <w:tr>
-        <w:tc>
-          <w:tcPr>
-            <w:tcW w:type="dxa" w:w="1728"/>
-          </w:tcPr>
-          <w:p>
-            <w:r>
-              <w:t>`iOSApp/Views/PlannerView.swift`</w:t>
-            </w:r>
-          </w:p>
-        </w:tc>
-        <w:tc>
-          <w:tcPr>
-            <w:tcW w:type="dxa" w:w="1728"/>
-          </w:tcPr>
-          <w:p>
-            <w:r>
-              <w:t>`BRIEFING`</w:t>
-            </w:r>
-          </w:p>
-        </w:tc>
-        <w:tc>
-          <w:tcPr>
-            <w:tcW w:type="dxa" w:w="1728"/>
-          </w:tcPr>
-          <w:p>
-            <w:r>
-              <w:t>iOS Plan Result</w:t>
-            </w:r>
-          </w:p>
-        </w:tc>
-        <w:tc>
-          <w:tcPr>
-            <w:tcW w:type="dxa" w:w="1728"/>
-          </w:tcPr>
-          <w:p>
-            <w:r>
-              <w:t>Low</w:t>
-            </w:r>
-          </w:p>
-        </w:tc>
-        <w:tc>
-          <w:tcPr>
-            <w:tcW w:type="dxa" w:w="1728"/>
-          </w:tcPr>
-          <w:p>
-            <w:r>
-              <w:t>`planner.briefing.title`</w:t>
-            </w:r>
-          </w:p>
-        </w:tc>
-      </w:tr>
-      <w:tr>
-        <w:tc>
-          <w:tcPr>
-            <w:tcW w:type="dxa" w:w="1728"/>
-          </w:tcPr>
-          <w:p>
-            <w:r>
-              <w:t>`iOSApp/Views/PlannerView.swift`</w:t>
-            </w:r>
-          </w:p>
-        </w:tc>
-        <w:tc>
-          <w:tcPr>
-            <w:tcW w:type="dxa" w:w="1728"/>
-          </w:tcPr>
-          <w:p>
-            <w:r>
-              <w:t>`CURVA BUHLMANN ZH-L16C`</w:t>
-            </w:r>
-          </w:p>
-        </w:tc>
-        <w:tc>
-          <w:tcPr>
-            <w:tcW w:type="dxa" w:w="1728"/>
-          </w:tcPr>
-          <w:p>
-            <w:r>
-              <w:t>iOS Plan Result</w:t>
-            </w:r>
-          </w:p>
-        </w:tc>
-        <w:tc>
-          <w:tcPr>
-            <w:tcW w:type="dxa" w:w="1728"/>
-          </w:tcPr>
-          <w:p>
-            <w:r>
-              <w:t>Low</w:t>
-            </w:r>
-          </w:p>
-        </w:tc>
-        <w:tc>
-          <w:tcPr>
-            <w:tcW w:type="dxa" w:w="1728"/>
-          </w:tcPr>
-          <w:p>
-            <w:r>
-              <w:t>`planner.buhlmann.curve_title`</w:t>
-            </w:r>
-          </w:p>
-        </w:tc>
-      </w:tr>
-      <w:tr>
-        <w:tc>
-          <w:tcPr>
-            <w:tcW w:type="dxa" w:w="1728"/>
-          </w:tcPr>
-          <w:p>
-            <w:r>
-              <w:t>`iOSApp/Views/MoreView.swift` + `iOSApp/Resources/it.lproj/Localizable.strings`</w:t>
-            </w:r>
-          </w:p>
-        </w:tc>
-        <w:tc>
-          <w:tcPr>
-            <w:tcW w:type="dxa" w:w="1728"/>
-          </w:tcPr>
-          <w:p>
-            <w:r>
-              <w:t>`Planner safety`</w:t>
-            </w:r>
-          </w:p>
-        </w:tc>
-        <w:tc>
-          <w:tcPr>
-            <w:tcW w:type="dxa" w:w="1728"/>
-          </w:tcPr>
-          <w:p>
-            <w:r>
-              <w:t>iOS More</w:t>
-            </w:r>
-          </w:p>
-        </w:tc>
-        <w:tc>
-          <w:tcPr>
-            <w:tcW w:type="dxa" w:w="1728"/>
-          </w:tcPr>
-          <w:p>
-            <w:r>
-              <w:t>Low</w:t>
-            </w:r>
-          </w:p>
-        </w:tc>
-        <w:tc>
-          <w:tcPr>
-            <w:tcW w:type="dxa" w:w="1728"/>
-          </w:tcPr>
-          <w:p>
-            <w:r>
-              <w:t>`more.planner_safety.title`</w:t>
-            </w:r>
-          </w:p>
-        </w:tc>
-      </w:tr>
-      <w:tr>
-        <w:tc>
-          <w:tcPr>
-            <w:tcW w:type="dxa" w:w="1728"/>
-          </w:tcPr>
-          <w:p>
-            <w:r>
-              <w:t>`iOSApp/Resources/it.lproj/Localizable.strings`</w:t>
-            </w:r>
-          </w:p>
-        </w:tc>
-        <w:tc>
-          <w:tcPr>
-            <w:tcW w:type="dxa" w:w="1728"/>
-          </w:tcPr>
-          <w:p>
-            <w:r>
-              <w:t>`Subsurface CSV metrico; altri formati planned`</w:t>
-            </w:r>
-          </w:p>
-        </w:tc>
-        <w:tc>
-          <w:tcPr>
-            <w:tcW w:type="dxa" w:w="1728"/>
-          </w:tcPr>
-          <w:p>
-            <w:r>
-              <w:t>iOS units/export copy</w:t>
-            </w:r>
-          </w:p>
-        </w:tc>
-        <w:tc>
-          <w:tcPr>
-            <w:tcW w:type="dxa" w:w="1728"/>
-          </w:tcPr>
-          <w:p>
-            <w:r>
-              <w:t>Low</w:t>
-            </w:r>
-          </w:p>
-        </w:tc>
-        <w:tc>
-          <w:tcPr>
-            <w:tcW w:type="dxa" w:w="1728"/>
-          </w:tcPr>
-          <w:p>
-            <w:r>
-              <w:t>split into fully localized Italian phrasing</w:t>
-            </w:r>
-          </w:p>
-        </w:tc>
-      </w:tr>
-      <w:tr>
-        <w:tc>
-          <w:tcPr>
-            <w:tcW w:type="dxa" w:w="1728"/>
-          </w:tcPr>
-          <w:p>
-            <w:r>
-              <w:t>`iOSApp/Resources/it.lproj/Localizable.strings`</w:t>
-            </w:r>
-          </w:p>
-        </w:tc>
-        <w:tc>
-          <w:tcPr>
-            <w:tcW w:type="dxa" w:w="1728"/>
-          </w:tcPr>
-          <w:p>
-            <w:r>
-              <w:t>`BACKUP CLOUD`, `REVIEWER`</w:t>
-            </w:r>
-          </w:p>
-        </w:tc>
-        <w:tc>
-          <w:tcPr>
-            <w:tcW w:type="dxa" w:w="1728"/>
-          </w:tcPr>
-          <w:p>
-            <w:r>
-              <w:t>iOS More headers</w:t>
-            </w:r>
-          </w:p>
-        </w:tc>
-        <w:tc>
-          <w:tcPr>
-            <w:tcW w:type="dxa" w:w="1728"/>
-          </w:tcPr>
-          <w:p>
-            <w:r>
-              <w:t>Low</w:t>
-            </w:r>
-          </w:p>
-        </w:tc>
-        <w:tc>
-          <w:tcPr>
-            <w:tcW w:type="dxa" w:w="1728"/>
-          </w:tcPr>
-          <w:p>
-            <w:r>
-              <w:t>fully localized section labels if desired</w:t>
+              <w:t>Verify bilingual screenshots and clipping on real device sizes before release</w:t>
             </w:r>
           </w:p>
         </w:tc>
@@ -11110,7 +10531,7 @@
         <w:pStyle w:val="ListBullet"/>
       </w:pPr>
       <w:r>
-        <w:t>Watch `BUSSOLA`: still the most visible remaining watch localization gap</w:t>
+        <w:t>Watch `BUSSOLA`: repo-side localization gap resolved</w:t>
       </w:r>
     </w:p>
     <w:p>
@@ -11118,7 +10539,7 @@
         <w:pStyle w:val="ListBullet"/>
       </w:pPr>
       <w:r>
-        <w:t>Watch `InfoView`: mostly small polish issue</w:t>
+        <w:t>Watch `InfoView`: repo-side wording gap resolved</w:t>
       </w:r>
     </w:p>
     <w:p>
@@ -11126,7 +10547,7 @@
         <w:pStyle w:val="ListBullet"/>
       </w:pPr>
       <w:r>
-        <w:t>iOS `Planner` / `PlanResultView`: biggest remaining localization debt in stable iOS UX</w:t>
+        <w:t>iOS `Planner` / `PlanResultView`: repo-side localization debt resolved in current MAIN</w:t>
       </w:r>
     </w:p>
     <w:p>
@@ -11134,7 +10555,7 @@
         <w:pStyle w:val="ListBullet"/>
       </w:pPr>
       <w:r>
-        <w:t>iOS `More`: mostly localized, but a few labels still mix English and Italian in Italian mode</w:t>
+        <w:t>iOS `More`: stable labels normalized in current MAIN</w:t>
       </w:r>
     </w:p>
     <w:p/>
@@ -11548,7 +10969,7 @@
           </w:tcPr>
           <w:p>
             <w:r>
-              <w:t>Weak</w:t>
+              <w:t>Good</w:t>
             </w:r>
           </w:p>
         </w:tc>
@@ -11558,7 +10979,7 @@
           </w:tcPr>
           <w:p>
             <w:r>
-              <w:t>Medium</w:t>
+              <w:t>Low</w:t>
             </w:r>
           </w:p>
         </w:tc>
@@ -11568,7 +10989,7 @@
           </w:tcPr>
           <w:p>
             <w:r>
-              <w:t>Visible but both point to repository root, not reviewer-grade legal pages</w:t>
+              <w:t>Dedicated legal destinations now exist in `Docs/TERMS_OF_USE.md` and `Docs/PRIVACY_AND_DATA_USE.md`</w:t>
             </w:r>
           </w:p>
         </w:tc>
@@ -11652,7 +11073,7 @@
           </w:tcPr>
           <w:p>
             <w:r>
-              <w:t>Current legal-link quality and lack of entitlement/device evidence remain submission risks</w:t>
+              <w:t>Remaining risk is now driven mainly by entitlement/device evidence, not by missing legal destinations in the repo</w:t>
             </w:r>
           </w:p>
         </w:tc>
@@ -11690,7 +11111,7 @@
         <w:pStyle w:val="ListBullet"/>
       </w:pPr>
       <w:r>
-        <w:t>Legal destinations should still be improved before submission</w:t>
+        <w:t>Legal destinations are now present; remaining safety/readiness work is external provisioning plus real hardware evidence</w:t>
       </w:r>
     </w:p>
     <w:p/>
@@ -12498,7 +11919,7 @@
           </w:tcPr>
           <w:p>
             <w:r>
-              <w:t>Terms and Privacy links point to repository root</w:t>
+              <w:t>Repo-side medium/low findings from the original audit</w:t>
             </w:r>
           </w:p>
         </w:tc>
@@ -12508,7 +11929,7 @@
           </w:tcPr>
           <w:p>
             <w:r>
-              <w:t>Watch + iOS legal screens</w:t>
+              <w:t>Watch + iOS stable UX</w:t>
             </w:r>
           </w:p>
         </w:tc>
@@ -12518,7 +11939,7 @@
           </w:tcPr>
           <w:p>
             <w:r>
-              <w:t>`WatchLegalOnboardingView.swift`, `IOSLegalOnboardingView.swift`</w:t>
+              <w:t>Legal / Info / Compass / Planner / More / Sync / Stopwatch surfaces</w:t>
             </w:r>
           </w:p>
         </w:tc>
@@ -12528,7 +11949,7 @@
           </w:tcPr>
           <w:p>
             <w:r>
-              <w:t>Medium</w:t>
+              <w:t>Resolved</w:t>
             </w:r>
           </w:p>
         </w:tc>
@@ -12538,7 +11959,7 @@
           </w:tcPr>
           <w:p>
             <w:r>
-              <w:t>Weak legal/reviewer experience; potential submission concern</w:t>
+              <w:t>No longer blocking current `main`</w:t>
             </w:r>
           </w:p>
         </w:tc>
@@ -12548,7 +11969,7 @@
           </w:tcPr>
           <w:p>
             <w:r>
-              <w:t>Replace with dedicated legal destinations</w:t>
+              <w:t>Fixed on current `main`; keep regression coverage via simulator builds and future QA</w:t>
             </w:r>
           </w:p>
         </w:tc>
@@ -12558,583 +11979,7 @@
           </w:tcPr>
           <w:p>
             <w:r>
-              <w:t>Copy-only / UI-only</w:t>
-            </w:r>
-          </w:p>
-        </w:tc>
-      </w:tr>
-      <w:tr>
-        <w:tc>
-          <w:tcPr>
-            <w:tcW w:type="dxa" w:w="1234"/>
-          </w:tcPr>
-          <w:p>
-            <w:r>
-              <w:t>Watch Info entitlement diagnostics overstate readiness</w:t>
-            </w:r>
-          </w:p>
-        </w:tc>
-        <w:tc>
-          <w:tcPr>
-            <w:tcW w:type="dxa" w:w="1234"/>
-          </w:tcPr>
-          <w:p>
-            <w:r>
-              <w:t>Watch</w:t>
-            </w:r>
-          </w:p>
-        </w:tc>
-        <w:tc>
-          <w:tcPr>
-            <w:tcW w:type="dxa" w:w="1234"/>
-          </w:tcPr>
-          <w:p>
-            <w:r>
-              <w:t>`Views/InfoView.swift`</w:t>
-            </w:r>
-          </w:p>
-        </w:tc>
-        <w:tc>
-          <w:tcPr>
-            <w:tcW w:type="dxa" w:w="1234"/>
-          </w:tcPr>
-          <w:p>
-            <w:r>
-              <w:t>Medium</w:t>
-            </w:r>
-          </w:p>
-        </w:tc>
-        <w:tc>
-          <w:tcPr>
-            <w:tcW w:type="dxa" w:w="1234"/>
-          </w:tcPr>
-          <w:p>
-            <w:r>
-              <w:t>Testers may read “Configured” as “release-ready” even when signed builds fail</w:t>
-            </w:r>
-          </w:p>
-        </w:tc>
-        <w:tc>
-          <w:tcPr>
-            <w:tcW w:type="dxa" w:w="1234"/>
-          </w:tcPr>
-          <w:p>
-            <w:r>
-              <w:t>Reword diagnostics to distinguish static config from provisioning approval</w:t>
-            </w:r>
-          </w:p>
-        </w:tc>
-        <w:tc>
-          <w:tcPr>
-            <w:tcW w:type="dxa" w:w="1234"/>
-          </w:tcPr>
-          <w:p>
-            <w:r>
-              <w:t>Copy-only</w:t>
-            </w:r>
-          </w:p>
-        </w:tc>
-      </w:tr>
-      <w:tr>
-        <w:tc>
-          <w:tcPr>
-            <w:tcW w:type="dxa" w:w="1234"/>
-          </w:tcPr>
-          <w:p>
-            <w:r>
-              <w:t>Compass bearing controls still mixed-language</w:t>
-            </w:r>
-          </w:p>
-        </w:tc>
-        <w:tc>
-          <w:tcPr>
-            <w:tcW w:type="dxa" w:w="1234"/>
-          </w:tcPr>
-          <w:p>
-            <w:r>
-              <w:t>Watch</w:t>
-            </w:r>
-          </w:p>
-        </w:tc>
-        <w:tc>
-          <w:tcPr>
-            <w:tcW w:type="dxa" w:w="1234"/>
-          </w:tcPr>
-          <w:p>
-            <w:r>
-              <w:t>`Views/CompassView.swift`</w:t>
-            </w:r>
-          </w:p>
-        </w:tc>
-        <w:tc>
-          <w:tcPr>
-            <w:tcW w:type="dxa" w:w="1234"/>
-          </w:tcPr>
-          <w:p>
-            <w:r>
-              <w:t>Medium</w:t>
-            </w:r>
-          </w:p>
-        </w:tc>
-        <w:tc>
-          <w:tcPr>
-            <w:tcW w:type="dxa" w:w="1234"/>
-          </w:tcPr>
-          <w:p>
-            <w:r>
-              <w:t>Core navigation screen still looks partially unfinished in EN/IT audit</w:t>
-            </w:r>
-          </w:p>
-        </w:tc>
-        <w:tc>
-          <w:tcPr>
-            <w:tcW w:type="dxa" w:w="1234"/>
-          </w:tcPr>
-          <w:p>
-            <w:r>
-              <w:t>Localize control labels and formatted bearing line</w:t>
-            </w:r>
-          </w:p>
-        </w:tc>
-        <w:tc>
-          <w:tcPr>
-            <w:tcW w:type="dxa" w:w="1234"/>
-          </w:tcPr>
-          <w:p>
-            <w:r>
-              <w:t>UI-only</w:t>
-            </w:r>
-          </w:p>
-        </w:tc>
-      </w:tr>
-      <w:tr>
-        <w:tc>
-          <w:tcPr>
-            <w:tcW w:type="dxa" w:w="1234"/>
-          </w:tcPr>
-          <w:p>
-            <w:r>
-              <w:t>Planner result cards still mixed-language</w:t>
-            </w:r>
-          </w:p>
-        </w:tc>
-        <w:tc>
-          <w:tcPr>
-            <w:tcW w:type="dxa" w:w="1234"/>
-          </w:tcPr>
-          <w:p>
-            <w:r>
-              <w:t>iOS</w:t>
-            </w:r>
-          </w:p>
-        </w:tc>
-        <w:tc>
-          <w:tcPr>
-            <w:tcW w:type="dxa" w:w="1234"/>
-          </w:tcPr>
-          <w:p>
-            <w:r>
-              <w:t>`iOSApp/Views/PlannerView.swift`</w:t>
-            </w:r>
-          </w:p>
-        </w:tc>
-        <w:tc>
-          <w:tcPr>
-            <w:tcW w:type="dxa" w:w="1234"/>
-          </w:tcPr>
-          <w:p>
-            <w:r>
-              <w:t>Medium</w:t>
-            </w:r>
-          </w:p>
-        </w:tc>
-        <w:tc>
-          <w:tcPr>
-            <w:tcW w:type="dxa" w:w="1234"/>
-          </w:tcPr>
-          <w:p>
-            <w:r>
-              <w:t>High-value planning flow feels less polished and less reviewer-ready</w:t>
-            </w:r>
-          </w:p>
-        </w:tc>
-        <w:tc>
-          <w:tcPr>
-            <w:tcW w:type="dxa" w:w="1234"/>
-          </w:tcPr>
-          <w:p>
-            <w:r>
-              <w:t>Finish localization of remaining literal labels</w:t>
-            </w:r>
-          </w:p>
-        </w:tc>
-        <w:tc>
-          <w:tcPr>
-            <w:tcW w:type="dxa" w:w="1234"/>
-          </w:tcPr>
-          <w:p>
-            <w:r>
-              <w:t>UI-only</w:t>
-            </w:r>
-          </w:p>
-        </w:tc>
-      </w:tr>
-      <w:tr>
-        <w:tc>
-          <w:tcPr>
-            <w:tcW w:type="dxa" w:w="1234"/>
-          </w:tcPr>
-          <w:p>
-            <w:r>
-              <w:t>Planner shows disabled non-advanced modes</w:t>
-            </w:r>
-          </w:p>
-        </w:tc>
-        <w:tc>
-          <w:tcPr>
-            <w:tcW w:type="dxa" w:w="1234"/>
-          </w:tcPr>
-          <w:p>
-            <w:r>
-              <w:t>iOS</w:t>
-            </w:r>
-          </w:p>
-        </w:tc>
-        <w:tc>
-          <w:tcPr>
-            <w:tcW w:type="dxa" w:w="1234"/>
-          </w:tcPr>
-          <w:p>
-            <w:r>
-              <w:t>`iOSApp/Views/PlannerView.swift`</w:t>
-            </w:r>
-          </w:p>
-        </w:tc>
-        <w:tc>
-          <w:tcPr>
-            <w:tcW w:type="dxa" w:w="1234"/>
-          </w:tcPr>
-          <w:p>
-            <w:r>
-              <w:t>Medium</w:t>
-            </w:r>
-          </w:p>
-        </w:tc>
-        <w:tc>
-          <w:tcPr>
-            <w:tcW w:type="dxa" w:w="1234"/>
-          </w:tcPr>
-          <w:p>
-            <w:r>
-              <w:t>Users can see future modes that are not actually available</w:t>
-            </w:r>
-          </w:p>
-        </w:tc>
-        <w:tc>
-          <w:tcPr>
-            <w:tcW w:type="dxa" w:w="1234"/>
-          </w:tcPr>
-          <w:p>
-            <w:r>
-              <w:t>Keep visible but reframe as planned, or hide until active</w:t>
-            </w:r>
-          </w:p>
-        </w:tc>
-        <w:tc>
-          <w:tcPr>
-            <w:tcW w:type="dxa" w:w="1234"/>
-          </w:tcPr>
-          <w:p>
-            <w:r>
-              <w:t>UI-only</w:t>
-            </w:r>
-          </w:p>
-        </w:tc>
-      </w:tr>
-      <w:tr>
-        <w:tc>
-          <w:tcPr>
-            <w:tcW w:type="dxa" w:w="1234"/>
-          </w:tcPr>
-          <w:p>
-            <w:r>
-              <w:t>Planner metric-only behavior can feel inconsistent with global units</w:t>
-            </w:r>
-          </w:p>
-        </w:tc>
-        <w:tc>
-          <w:tcPr>
-            <w:tcW w:type="dxa" w:w="1234"/>
-          </w:tcPr>
-          <w:p>
-            <w:r>
-              <w:t>iOS</w:t>
-            </w:r>
-          </w:p>
-        </w:tc>
-        <w:tc>
-          <w:tcPr>
-            <w:tcW w:type="dxa" w:w="1234"/>
-          </w:tcPr>
-          <w:p>
-            <w:r>
-              <w:t>`iOSApp/Views/PlannerView.swift`, related strings</w:t>
-            </w:r>
-          </w:p>
-        </w:tc>
-        <w:tc>
-          <w:tcPr>
-            <w:tcW w:type="dxa" w:w="1234"/>
-          </w:tcPr>
-          <w:p>
-            <w:r>
-              <w:t>Medium</w:t>
-            </w:r>
-          </w:p>
-        </w:tc>
-        <w:tc>
-          <w:tcPr>
-            <w:tcW w:type="dxa" w:w="1234"/>
-          </w:tcPr>
-          <w:p>
-            <w:r>
-              <w:t>Imperial users encounter mixed expectations</w:t>
-            </w:r>
-          </w:p>
-        </w:tc>
-        <w:tc>
-          <w:tcPr>
-            <w:tcW w:type="dxa" w:w="1234"/>
-          </w:tcPr>
-          <w:p>
-            <w:r>
-              <w:t>Keep honest note and consider clearer framing or full presentation conversion later</w:t>
-            </w:r>
-          </w:p>
-        </w:tc>
-        <w:tc>
-          <w:tcPr>
-            <w:tcW w:type="dxa" w:w="1234"/>
-          </w:tcPr>
-          <w:p>
-            <w:r>
-              <w:t>Small functional or UI-only</w:t>
-            </w:r>
-          </w:p>
-        </w:tc>
-      </w:tr>
-      <w:tr>
-        <w:tc>
-          <w:tcPr>
-            <w:tcW w:type="dxa" w:w="1234"/>
-          </w:tcPr>
-          <w:p>
-            <w:r>
-              <w:t>Sync status is aggregate, not per-session</w:t>
-            </w:r>
-          </w:p>
-        </w:tc>
-        <w:tc>
-          <w:tcPr>
-            <w:tcW w:type="dxa" w:w="1234"/>
-          </w:tcPr>
-          <w:p>
-            <w:r>
-              <w:t>Watch + iOS</w:t>
-            </w:r>
-          </w:p>
-        </w:tc>
-        <w:tc>
-          <w:tcPr>
-            <w:tcW w:type="dxa" w:w="1234"/>
-          </w:tcPr>
-          <w:p>
-            <w:r>
-              <w:t>Sync surfaces</w:t>
-            </w:r>
-          </w:p>
-        </w:tc>
-        <w:tc>
-          <w:tcPr>
-            <w:tcW w:type="dxa" w:w="1234"/>
-          </w:tcPr>
-          <w:p>
-            <w:r>
-              <w:t>Medium</w:t>
-            </w:r>
-          </w:p>
-        </w:tc>
-        <w:tc>
-          <w:tcPr>
-            <w:tcW w:type="dxa" w:w="1234"/>
-          </w:tcPr>
-          <w:p>
-            <w:r>
-              <w:t>Harder to verify a specific dive/photo transfer</w:t>
-            </w:r>
-          </w:p>
-        </w:tc>
-        <w:tc>
-          <w:tcPr>
-            <w:tcW w:type="dxa" w:w="1234"/>
-          </w:tcPr>
-          <w:p>
-            <w:r>
-              <w:t>Add per-item delivery trace later</w:t>
-            </w:r>
-          </w:p>
-        </w:tc>
-        <w:tc>
-          <w:tcPr>
-            <w:tcW w:type="dxa" w:w="1234"/>
-          </w:tcPr>
-          <w:p>
-            <w:r>
-              <w:t>Small functional</w:t>
-            </w:r>
-          </w:p>
-        </w:tc>
-      </w:tr>
-      <w:tr>
-        <w:tc>
-          <w:tcPr>
-            <w:tcW w:type="dxa" w:w="1234"/>
-          </w:tcPr>
-          <w:p>
-            <w:r>
-              <w:t>Stopwatch reset lacks extra safeguard</w:t>
-            </w:r>
-          </w:p>
-        </w:tc>
-        <w:tc>
-          <w:tcPr>
-            <w:tcW w:type="dxa" w:w="1234"/>
-          </w:tcPr>
-          <w:p>
-            <w:r>
-              <w:t>Watch</w:t>
-            </w:r>
-          </w:p>
-        </w:tc>
-        <w:tc>
-          <w:tcPr>
-            <w:tcW w:type="dxa" w:w="1234"/>
-          </w:tcPr>
-          <w:p>
-            <w:r>
-              <w:t>`Views/DiveLiveView.swift`</w:t>
-            </w:r>
-          </w:p>
-        </w:tc>
-        <w:tc>
-          <w:tcPr>
-            <w:tcW w:type="dxa" w:w="1234"/>
-          </w:tcPr>
-          <w:p>
-            <w:r>
-              <w:t>Low</w:t>
-            </w:r>
-          </w:p>
-        </w:tc>
-        <w:tc>
-          <w:tcPr>
-            <w:tcW w:type="dxa" w:w="1234"/>
-          </w:tcPr>
-          <w:p>
-            <w:r>
-              <w:t>Surface/underwater accidental reset risk</w:t>
-            </w:r>
-          </w:p>
-        </w:tc>
-        <w:tc>
-          <w:tcPr>
-            <w:tcW w:type="dxa" w:w="1234"/>
-          </w:tcPr>
-          <w:p>
-            <w:r>
-              <w:t>Consider long-press or confirm flow after UX review</w:t>
-            </w:r>
-          </w:p>
-        </w:tc>
-        <w:tc>
-          <w:tcPr>
-            <w:tcW w:type="dxa" w:w="1234"/>
-          </w:tcPr>
-          <w:p>
-            <w:r>
-              <w:t>UI-only / small functional</w:t>
-            </w:r>
-          </w:p>
-        </w:tc>
-      </w:tr>
-      <w:tr>
-        <w:tc>
-          <w:tcPr>
-            <w:tcW w:type="dxa" w:w="1234"/>
-          </w:tcPr>
-          <w:p>
-            <w:r>
-              <w:t>More/legal copy still partially mixed-language</w:t>
-            </w:r>
-          </w:p>
-        </w:tc>
-        <w:tc>
-          <w:tcPr>
-            <w:tcW w:type="dxa" w:w="1234"/>
-          </w:tcPr>
-          <w:p>
-            <w:r>
-              <w:t>iOS</w:t>
-            </w:r>
-          </w:p>
-        </w:tc>
-        <w:tc>
-          <w:tcPr>
-            <w:tcW w:type="dxa" w:w="1234"/>
-          </w:tcPr>
-          <w:p>
-            <w:r>
-              <w:t>`iOSApp/Views/MoreView.swift`, localized strings</w:t>
-            </w:r>
-          </w:p>
-        </w:tc>
-        <w:tc>
-          <w:tcPr>
-            <w:tcW w:type="dxa" w:w="1234"/>
-          </w:tcPr>
-          <w:p>
-            <w:r>
-              <w:t>Low</w:t>
-            </w:r>
-          </w:p>
-        </w:tc>
-        <w:tc>
-          <w:tcPr>
-            <w:tcW w:type="dxa" w:w="1234"/>
-          </w:tcPr>
-          <w:p>
-            <w:r>
-              <w:t>Polish issue in stable settings surface</w:t>
-            </w:r>
-          </w:p>
-        </w:tc>
-        <w:tc>
-          <w:tcPr>
-            <w:tcW w:type="dxa" w:w="1234"/>
-          </w:tcPr>
-          <w:p>
-            <w:r>
-              <w:t>Normalize Italian/English labels</w:t>
-            </w:r>
-          </w:p>
-        </w:tc>
-        <w:tc>
-          <w:tcPr>
-            <w:tcW w:type="dxa" w:w="1234"/>
-          </w:tcPr>
-          <w:p>
-            <w:r>
-              <w:t>UI-only</w:t>
+              <w:t>Resolved in repo</w:t>
             </w:r>
           </w:p>
         </w:tc>
@@ -13230,16 +12075,7 @@
           <w:b w:val="0"/>
           <w:sz w:val="20"/>
         </w:rPr>
-        <w:t>3. Replace repo-root Terms / Privacy destinations with real reviewer-grade legal pages</w:t>
-      </w:r>
-    </w:p>
-    <w:p>
-      <w:r>
-        <w:rPr>
-          <w:b w:val="0"/>
-          <w:sz w:val="20"/>
-        </w:rPr>
-        <w:t>4. Tighten `InfoView` wording so entitlement status is honest</w:t>
+        <w:t>3. Archive/store device evidence that the underwater path behaves as documented on approved hardware</w:t>
       </w:r>
     </w:p>
     <w:p/>
@@ -13258,7 +12094,7 @@
           <w:b w:val="0"/>
           <w:sz w:val="20"/>
         </w:rPr>
-        <w:t>1. Finish remaining planner / compass / More mixed-language cleanup</w:t>
+        <w:t>1. Reconfirm bilingual screenshots and clipping on real device sizes</w:t>
       </w:r>
     </w:p>
     <w:p>
@@ -13267,16 +12103,7 @@
           <w:b w:val="0"/>
           <w:sz w:val="20"/>
         </w:rPr>
-        <w:t>2. Reconfirm bilingual screenshots and clipping on real device sizes</w:t>
-      </w:r>
-    </w:p>
-    <w:p>
-      <w:r>
-        <w:rPr>
-          <w:b w:val="0"/>
-          <w:sz w:val="20"/>
-        </w:rPr>
-        <w:t>3. Keep all underwater/device claims aligned only to behavior verified on real hardware</w:t>
+        <w:t>2. Keep all underwater/device claims aligned only to behavior verified on real hardware</w:t>
       </w:r>
     </w:p>
     <w:p/>
@@ -13295,7 +12122,7 @@
           <w:b w:val="0"/>
           <w:sz w:val="20"/>
         </w:rPr>
-        <w:t>1. Add per-session sync visibility instead of aggregate-only state</w:t>
+        <w:t>1. Consider deeper sync history/ledger if QA wants more than the current recent-activity trace</w:t>
       </w:r>
     </w:p>
     <w:p>
@@ -13304,16 +12131,7 @@
           <w:b w:val="0"/>
           <w:sz w:val="20"/>
         </w:rPr>
-        <w:t>2. Revisit stopwatch reset safeguard</w:t>
-      </w:r>
-    </w:p>
-    <w:p>
-      <w:r>
-        <w:rPr>
-          <w:b w:val="0"/>
-          <w:sz w:val="20"/>
-        </w:rPr>
-        <w:t>3. Decide whether disabled planner modes should remain visible in stable MAIN</w:t>
+        <w:t>2. Consider expanding planner unit presentation beyond the current honest metric/bar framing if product scope changes</w:t>
       </w:r>
     </w:p>
     <w:p/>
@@ -13470,7 +12288,7 @@
           </w:tcPr>
           <w:p>
             <w:r>
-              <w:t>Too much release confidence still depends on unverified Watch Ultra behavior and unresolved legal/reviewer polish</w:t>
+              <w:t>Repo-side polish issues from the original audit are fixed, but release confidence still depends on unverified Watch Ultra behavior</w:t>
             </w:r>
           </w:p>
         </w:tc>
@@ -13534,7 +12352,7 @@
           </w:tcPr>
           <w:p>
             <w:r>
-              <w:t>Same entitlement/device blocker, plus legal destination quality and final localization cleanup still need attention</w:t>
+              <w:t>The remaining blocker is the same entitlement/device-evidence gap; repo-side legal/localization cleanup is no longer the reason it is blocked</w:t>
             </w:r>
           </w:p>
         </w:tc>
@@ -13556,7 +12374,7 @@
           </w:tcPr>
           <w:p>
             <w:r>
-              <w:t>**Provisioning approval + device evidence + polish**</w:t>
+              <w:t>**Provisioning approval + device evidence**</w:t>
             </w:r>
           </w:p>
         </w:tc>
@@ -13566,7 +12384,7 @@
           </w:tcPr>
           <w:p>
             <w:r>
-              <w:t>The primary blocker is external signing/provisioning, followed by real device proof and a smaller cleanup pass on planner/compass/legal strings</w:t>
+              <w:t>Current validation indicates that 100% release readiness is no longer blocked by repo-side issues; the remaining blockers are Apple signing approval and real hardware proof</w:t>
             </w:r>
           </w:p>
         </w:tc>
@@ -13588,7 +12406,7 @@
           <w:b w:val="0"/>
           <w:sz w:val="20"/>
         </w:rPr>
-        <w:t>The current `main` branch is **substantially ready from a stable-UI and simulator-readiness perspective**. This is no longer a branch suffering from major MAIN navigation collapse or accidental experimental dependency. The remaining blockers are narrower and well-defined:</w:t>
+        <w:t>The current `main` branch is **repo-ready, polished, and simulator-ready**. This is no longer a branch suffering from major MAIN navigation collapse, accidental experimental dependency, or unresolved stable-UI polish debt. The remaining blockers are narrower and well-defined:</w:t>
       </w:r>
     </w:p>
     <w:p/>
@@ -13616,7 +12434,7 @@
           <w:b w:val="0"/>
           <w:sz w:val="20"/>
         </w:rPr>
-        <w:t>3. a final polish pass should close mixed-language planner/compass/legal issues before release</w:t>
+        <w:t>3. release confidence must be backed by real hardware evidence before submission</w:t>
       </w:r>
     </w:p>
     <w:p/>

</xml_diff>